<commit_message>
Publish updated CV and portfolio content
- Refresh homepage, resume, and project pages with plain hyphens
- Add matching PDF CV download alongside the DOCX
- Update downloadable CV and build output
</commit_message>
<xml_diff>
--- a/Nikos-Lazaridis-CV.docx
+++ b/Nikos-Lazaridis-CV.docx
@@ -2,594 +2,718 @@
 <file path=word/document.xml><?xml version="1.0" encoding="utf-8"?>
 <w:document xmlns:wpc="http://schemas.microsoft.com/office/word/2010/wordprocessingCanvas" xmlns:mo="http://schemas.microsoft.com/office/mac/office/2008/main" xmlns:mc="http://schemas.openxmlformats.org/markup-compatibility/2006" xmlns:mv="urn:schemas-microsoft-com:mac:vml" xmlns:o="urn:schemas-microsoft-com:office:office" xmlns:r="http://schemas.openxmlformats.org/officeDocument/2006/relationships" xmlns:m="http://schemas.openxmlformats.org/officeDocument/2006/math" xmlns:v="urn:schemas-microsoft-com:vml" xmlns:wp14="http://schemas.microsoft.com/office/word/2010/wordprocessingDrawing" xmlns:wp="http://schemas.openxmlformats.org/drawingml/2006/wordprocessingDrawing" xmlns:w10="urn:schemas-microsoft-com:office:word" xmlns:w="http://schemas.openxmlformats.org/wordprocessingml/2006/main" xmlns:w14="http://schemas.microsoft.com/office/word/2010/wordml" xmlns:wpg="http://schemas.microsoft.com/office/word/2010/wordprocessingGroup" xmlns:wpi="http://schemas.microsoft.com/office/word/2010/wordprocessingInk" xmlns:wne="http://schemas.microsoft.com/office/word/2006/wordml" xmlns:wps="http://schemas.microsoft.com/office/word/2010/wordprocessingShape" mc:Ignorable="w14 wp14">
   <w:body>
-    <w:tbl>
-      <w:tblPr>
-        <w:tblW w:type="dxa" w:w="10260"/>
-        <w:tblLayout w:type="fixed"/>
-        <w:tblLook w:firstColumn="1" w:firstRow="1" w:lastColumn="0" w:lastRow="0" w:noHBand="0" w:noVBand="1" w:val="04A0"/>
-        <w:tblLayout w:type="fixed"/>
-        <w:tblInd w:type="dxa" w:w="0"/>
-        <w:tblBorders>
-          <w:top w:val="nil"/>
-          <w:left w:val="nil"/>
-          <w:bottom w:val="nil"/>
-          <w:right w:val="nil"/>
-          <w:insideH w:val="nil"/>
-          <w:insideV w:val="nil"/>
-        </w:tblBorders>
-      </w:tblPr>
-      <w:tblGrid>
-        <w:gridCol w:w="8460"/>
-        <w:gridCol w:w="1800"/>
-      </w:tblGrid>
-      <w:tr>
-        <w:tc>
-          <w:tcPr>
-            <w:tcW w:type="dxa" w:w="8460"/>
-            <w:tcMar>
-              <w:top w:w="0" w:type="dxa"/>
-              <w:start w:w="0" w:type="dxa"/>
-              <w:bottom w:w="0" w:type="dxa"/>
-              <w:end w:w="180" w:type="dxa"/>
-            </w:tcMar>
-            <w:vAlign w:val="top"/>
-          </w:tcPr>
-          <w:p>
-            <w:pPr>
-              <w:keepNext/>
-              <w:widowControl/>
-              <w:spacing w:before="0" w:after="6" w:line="240" w:lineRule="auto"/>
-            </w:pPr>
-            <w:r>
-              <w:rPr>
-                <w:rFonts w:ascii="Arial" w:hAnsi="Arial"/>
-                <w:b/>
-                <w:color w:val="0F2B46"/>
-                <w:sz w:val="43"/>
-              </w:rPr>
-              <w:t>Nikos Lazaridis</w:t>
-            </w:r>
-          </w:p>
-          <w:p>
-            <w:pPr>
-              <w:keepNext/>
-              <w:widowControl/>
-              <w:spacing w:before="0" w:after="24" w:line="240" w:lineRule="auto"/>
-            </w:pPr>
-            <w:r>
-              <w:rPr>
-                <w:rFonts w:ascii="Arial" w:hAnsi="Arial"/>
-                <w:b/>
-                <w:color w:val="006974"/>
-                <w:sz w:val="20"/>
-              </w:rPr>
-              <w:t>Applied AI &amp; Automation Engineer | Local AI, APIs, Backend Integrations &amp; Technical Escalation</w:t>
-            </w:r>
-          </w:p>
-          <w:p>
-            <w:pPr>
-              <w:widowControl/>
-              <w:spacing w:before="0" w:after="40" w:line="240" w:lineRule="auto"/>
-            </w:pPr>
-            <w:r>
-              <w:rPr>
-                <w:rFonts w:ascii="Arial" w:hAnsi="Arial"/>
-                <w:color w:val="56626C"/>
-                <w:sz w:val="16"/>
-              </w:rPr>
-              <w:t>Greece</w:t>
-            </w:r>
-            <w:r>
-              <w:rPr>
-                <w:rFonts w:ascii="Arial" w:hAnsi="Arial"/>
-                <w:color w:val="56626C"/>
-                <w:sz w:val="16"/>
-              </w:rPr>
-              <w:t xml:space="preserve"> | </w:t>
-            </w:r>
-            <w:r>
-              <w:rPr>
-                <w:rFonts w:ascii="Arial" w:hAnsi="Arial"/>
-                <w:color w:val="56626C"/>
-                <w:sz w:val="16"/>
-              </w:rPr>
-              <w:t>(+30) 6972 689 545</w:t>
-            </w:r>
-            <w:r>
-              <w:rPr>
-                <w:rFonts w:ascii="Arial" w:hAnsi="Arial"/>
-                <w:color w:val="56626C"/>
-                <w:sz w:val="16"/>
-              </w:rPr>
-              <w:t xml:space="preserve"> | </w:t>
-            </w:r>
-            <w:hyperlink r:id="rId9">
-              <w:r>
-                <w:rPr>
-                  <w:rFonts w:ascii="Arial" w:hAnsi="Arial"/>
-                  <w:color w:val="56626C"/>
-                  <w:sz w:val="16"/>
-                </w:rPr>
-                <w:t>nikosleft@gmail.com</w:t>
-              </w:r>
-            </w:hyperlink>
-            <w:r>
-              <w:rPr>
-                <w:rFonts w:ascii="Arial" w:hAnsi="Arial"/>
-                <w:color w:val="56626C"/>
-                <w:sz w:val="16"/>
-              </w:rPr>
-              <w:t xml:space="preserve"> | </w:t>
-            </w:r>
-            <w:hyperlink r:id="rId10">
-              <w:r>
-                <w:rPr>
-                  <w:rFonts w:ascii="Arial" w:hAnsi="Arial"/>
-                  <w:color w:val="56626C"/>
-                  <w:sz w:val="16"/>
-                </w:rPr>
-                <w:t>github.com/nikosleft</w:t>
-              </w:r>
-            </w:hyperlink>
-            <w:r>
-              <w:rPr>
-                <w:rFonts w:ascii="Arial" w:hAnsi="Arial"/>
-                <w:color w:val="56626C"/>
-                <w:sz w:val="16"/>
-              </w:rPr>
-              <w:t xml:space="preserve"> | </w:t>
-            </w:r>
-            <w:hyperlink r:id="rId11">
-              <w:r>
-                <w:rPr>
-                  <w:rFonts w:ascii="Arial" w:hAnsi="Arial"/>
-                  <w:color w:val="56626C"/>
-                  <w:sz w:val="16"/>
-                </w:rPr>
-                <w:t>linkedin.com/in/nikos-lazaridis-425840221</w:t>
-              </w:r>
-            </w:hyperlink>
-          </w:p>
-        </w:tc>
-        <w:tc>
-          <w:tcPr>
-            <w:tcW w:type="dxa" w:w="1800"/>
-            <w:tcMar>
-              <w:top w:w="0" w:type="dxa"/>
-              <w:start w:w="0" w:type="dxa"/>
-              <w:bottom w:w="0" w:type="dxa"/>
-              <w:end w:w="0" w:type="dxa"/>
-            </w:tcMar>
-            <w:vAlign w:val="top"/>
-          </w:tcPr>
-          <w:p>
-            <w:pPr>
-              <w:spacing w:before="0" w:after="0"/>
-              <w:jc w:val="center"/>
-            </w:pPr>
-            <w:r>
-              <w:drawing>
-                <wp:inline xmlns:a="http://schemas.openxmlformats.org/drawingml/2006/main" xmlns:pic="http://schemas.openxmlformats.org/drawingml/2006/picture">
-                  <wp:extent cx="914400" cy="1142593"/>
-                  <wp:docPr id="1" name="Portrait of Nikos Lazaridis" descr="Professional portrait of Nikos Lazaridis"/>
-                  <wp:cNvGraphicFramePr>
-                    <a:graphicFrameLocks noChangeAspect="1"/>
-                  </wp:cNvGraphicFramePr>
-                  <a:graphic>
-                    <a:graphicData uri="http://schemas.openxmlformats.org/drawingml/2006/picture">
-                      <pic:pic>
-                        <pic:nvPicPr>
-                          <pic:cNvPr id="0" name="my face.png"/>
-                          <pic:cNvPicPr/>
-                        </pic:nvPicPr>
-                        <pic:blipFill>
-                          <a:blip r:embed="rId15"/>
-                          <a:stretch>
-                            <a:fillRect/>
-                          </a:stretch>
-                        </pic:blipFill>
-                        <pic:spPr>
-                          <a:xfrm>
-                            <a:off x="0" y="0"/>
-                            <a:ext cx="914400" cy="1142593"/>
-                          </a:xfrm>
-                          <a:prstGeom prst="rect"/>
-                        </pic:spPr>
-                      </pic:pic>
-                    </a:graphicData>
-                  </a:graphic>
-                </wp:inline>
-              </w:drawing>
-            </w:r>
-          </w:p>
-        </w:tc>
-      </w:tr>
-    </w:tbl>
     <w:p>
       <w:pPr>
-        <w:pStyle w:val="CVSection"/>
-        <w:widowControl/>
+        <w:spacing w:before="0" w:after="40"/>
       </w:pPr>
       <w:r>
+        <w:rPr>
+          <w:b/>
+          <w:color w:val="1F3A5F"/>
+          <w:sz w:val="46"/>
+        </w:rPr>
+        <w:t>Nikos Lazaridis</w:t>
+      </w:r>
+    </w:p>
+    <w:p>
+      <w:pPr>
+        <w:spacing w:before="0" w:after="80"/>
+      </w:pPr>
+      <w:r>
+        <w:rPr>
+          <w:b/>
+          <w:color w:val="333333"/>
+          <w:sz w:val="24"/>
+        </w:rPr>
+        <w:t>Software Developer | AI Applications &amp; Backend Systems</w:t>
+      </w:r>
+    </w:p>
+    <w:p>
+      <w:pPr>
+        <w:spacing w:before="0" w:after="40"/>
+      </w:pPr>
+      <w:r>
+        <w:rPr>
+          <w:color w:val="555555"/>
+          <w:sz w:val="20"/>
+        </w:rPr>
+        <w:t xml:space="preserve">Greece · EU citizen  |  </w:t>
+      </w:r>
+      <w:hyperlink r:id="rId9">
+        <w:r>
+          <w:rPr>
+            <w:color w:val="1F3A5F"/>
+            <w:u w:val="single"/>
+          </w:rPr>
+          <w:t xml:space="preserve">nikosleft@gmail.com</w:t>
+        </w:r>
+      </w:hyperlink>
+      <w:r>
+        <w:rPr>
+          <w:color w:val="555555"/>
+          <w:sz w:val="20"/>
+        </w:rPr>
+        <w:t xml:space="preserve">  |  </w:t>
+      </w:r>
+      <w:hyperlink r:id="rId10">
+        <w:r>
+          <w:rPr>
+            <w:color w:val="1F3A5F"/>
+            <w:u w:val="single"/>
+          </w:rPr>
+          <w:t xml:space="preserve">github.com/nikosleft</w:t>
+        </w:r>
+      </w:hyperlink>
+      <w:r>
+        <w:rPr>
+          <w:color w:val="555555"/>
+          <w:sz w:val="20"/>
+        </w:rPr>
+        <w:t xml:space="preserve">  |  </w:t>
+      </w:r>
+      <w:hyperlink r:id="rId11">
+        <w:r>
+          <w:rPr>
+            <w:color w:val="1F3A5F"/>
+            <w:u w:val="single"/>
+          </w:rPr>
+          <w:t xml:space="preserve">linkedin.com/in/nikos-lazaridis-425840221</w:t>
+        </w:r>
+      </w:hyperlink>
+      <w:r>
+        <w:rPr>
+          <w:color w:val="555555"/>
+          <w:sz w:val="20"/>
+        </w:rPr>
+        <w:t xml:space="preserve">  |  </w:t>
+      </w:r>
+      <w:hyperlink r:id="rId12">
+        <w:r>
+          <w:rPr>
+            <w:color w:val="1F3A5F"/>
+            <w:u w:val="single"/>
+          </w:rPr>
+          <w:t xml:space="preserve">nikosleft.github.io</w:t>
+        </w:r>
+      </w:hyperlink>
+    </w:p>
+    <w:p>
+      <w:pPr>
+        <w:spacing w:before="200" w:after="80"/>
+        <w:pBdr>
+          <w:bottom w:val="single" w:sz="8" w:space="3" w:color="B7BCC2"/>
+        </w:pBdr>
+      </w:pPr>
+      <w:r>
+        <w:rPr>
+          <w:rFonts w:ascii="Calibri" w:hAnsi="Calibri"/>
+          <w:b/>
+          <w:color w:val="1F3A5F"/>
+          <w:sz w:val="21"/>
+        </w:rPr>
         <w:t>PROFILE</w:t>
       </w:r>
     </w:p>
     <w:p>
       <w:pPr>
-        <w:widowControl/>
-        <w:spacing w:before="0" w:after="20" w:line="240" w:lineRule="auto"/>
+        <w:spacing w:before="0" w:after="40"/>
       </w:pPr>
       <w:r>
-        <w:t>Applied AI and automation builder with self-directed software projects and operational experience supporting Audi digital-services and Mercedes-Benz roadside-assistance programs through Teleperformance. Builds local-first AI applications, API/backend integrations, and game prototypes; diagnoses complex technical cases, interprets logs and internal documentation, and explains solutions clearly. Targeting applied AI, AI automation, backend/API integration, solutions, and technical support engineering roles.</w:t>
+        <w:rPr>
+          <w:b w:val="0"/>
+          <w:i w:val="0"/>
+          <w:sz w:val="21"/>
+        </w:rPr>
+        <w:t>Software developer focused on AI applications and backend systems. Since July 2025, I have built independent projects spanning local AI tools, backend integrations, image-generation workflows, and developer tooling. My previous experience in technical escalation informs my approach to systems debugging and communicating technical solutions.</w:t>
       </w:r>
     </w:p>
     <w:p>
       <w:pPr>
-        <w:pStyle w:val="CVSection"/>
-        <w:widowControl/>
-      </w:pPr>
-      <w:r>
-        <w:t>CORE SKILLS</w:t>
-      </w:r>
-    </w:p>
-    <w:p>
-      <w:pPr>
-        <w:widowControl/>
-        <w:spacing w:before="0" w:after="7" w:line="240" w:lineRule="auto"/>
+        <w:spacing w:before="200" w:after="80"/>
+        <w:pBdr>
+          <w:bottom w:val="single" w:sz="8" w:space="3" w:color="B7BCC2"/>
+        </w:pBdr>
       </w:pPr>
       <w:r>
         <w:rPr>
-          <w:rFonts w:ascii="Arial" w:hAnsi="Arial"/>
-          <w:b w:val="0"/>
-          <w:color w:val="232A30"/>
-          <w:sz w:val="18"/>
+          <w:rFonts w:ascii="Calibri" w:hAnsi="Calibri"/>
+          <w:b/>
+          <w:color w:val="1F3A5F"/>
+          <w:sz w:val="21"/>
         </w:rPr>
-        <w:t>AI and software: Python, TypeScript/JavaScript, C++/C#, HTML/CSS, APIs and backend integrations, Docker, local AI models, LLM orchestration, Unreal Engine 5, Godot 4, Phaser 3</w:t>
-      </w:r>
-    </w:p>
-    <w:p>
-      <w:pPr>
-        <w:spacing w:before="0" w:after="7" w:line="240" w:lineRule="auto"/>
-      </w:pPr>
-      <w:r>
-        <w:rPr>
-          <w:rFonts w:ascii="Arial" w:hAnsi="Arial"/>
-          <w:b w:val="0"/>
-          <w:color w:val="232A30"/>
-          <w:sz w:val="18"/>
-        </w:rPr>
-        <w:t>Web and delivery: Progressive Web Apps (PWA), WebSockets, Cloudflare</w:t>
-      </w:r>
-    </w:p>
-    <w:p>
-      <w:pPr>
-        <w:widowControl/>
-        <w:spacing w:before="0" w:after="7" w:line="240" w:lineRule="auto"/>
-      </w:pPr>
-      <w:r>
-        <w:t>Operations: Level 2 escalation, digital-services and connected-car troubleshooting, case and log analysis, backend-reset coordination, technical communication, process and documentation improvement</w:t>
-      </w:r>
-    </w:p>
-    <w:p>
-      <w:pPr>
-        <w:widowControl/>
-        <w:spacing w:before="0" w:after="16" w:line="240" w:lineRule="auto"/>
-      </w:pPr>
-      <w:r>
-        <w:t>Platforms: Salesforce, Genesys, Microsoft Teams, proprietary operational systems</w:t>
-      </w:r>
-    </w:p>
-    <w:p>
-      <w:pPr>
-        <w:pStyle w:val="CVSection"/>
-        <w:widowControl/>
-      </w:pPr>
-      <w:r>
         <w:t>EXPERIENCE</w:t>
       </w:r>
     </w:p>
     <w:p>
       <w:pPr>
-        <w:keepNext/>
-        <w:widowControl/>
-        <w:spacing w:before="0" w:after="2" w:line="240" w:lineRule="auto"/>
+        <w:spacing w:before="40" w:after="0"/>
       </w:pPr>
       <w:r>
         <w:rPr>
-          <w:rFonts w:ascii="Arial" w:hAnsi="Arial"/>
           <w:b/>
-          <w:color w:val="0F2B46"/>
-          <w:sz w:val="18"/>
+          <w:sz w:val="22"/>
         </w:rPr>
-        <w:t>Teleperformance - Automotive Programs (Audi digital services; Mercedes-Benz roadside assistance)</w:t>
+        <w:t>Independent AI &amp; Software Development</w:t>
+      </w:r>
+      <w:r>
+        <w:rPr>
+          <w:color w:val="555555"/>
+          <w:sz w:val="20"/>
+        </w:rPr>
+        <w:t xml:space="preserve">   |   July 2025 - Present</w:t>
       </w:r>
     </w:p>
     <w:p>
       <w:pPr>
-        <w:keepNext/>
-        <w:widowControl/>
-        <w:spacing w:before="0" w:after="11" w:line="240" w:lineRule="auto"/>
+        <w:spacing w:before="0" w:after="120"/>
       </w:pPr>
       <w:r>
         <w:rPr>
-          <w:rFonts w:ascii="Arial" w:hAnsi="Arial"/>
+          <w:b w:val="0"/>
+          <w:i w:val="0"/>
+          <w:sz w:val="21"/>
+        </w:rPr>
+        <w:t>Built independent AI applications and developer tools spanning local-model integration, backend APIs, streaming workflows, automated testing, and systems debugging.</w:t>
+      </w:r>
+    </w:p>
+    <w:p>
+      <w:pPr>
+        <w:spacing w:before="40" w:after="0"/>
+      </w:pPr>
+      <w:r>
+        <w:rPr>
           <w:b/>
-          <w:color w:val="56626C"/>
-          <w:sz w:val="17"/>
+          <w:sz w:val="22"/>
         </w:rPr>
-        <w:t>Expert Team Specialist / Technical Support Specialist | Greece | Jan 2023 - Jul 2025</w:t>
+        <w:t>Teleperformance - Automotive Programs</w:t>
+      </w:r>
+    </w:p>
+    <w:p>
+      <w:pPr>
+        <w:spacing w:before="0" w:after="60"/>
+      </w:pPr>
+      <w:r>
+        <w:rPr>
+          <w:i/>
+          <w:sz w:val="20"/>
+        </w:rPr>
+        <w:t>Expert Team Specialist / Technical Support Specialist</w:t>
+      </w:r>
+      <w:r>
+        <w:rPr>
+          <w:color w:val="555555"/>
+          <w:sz w:val="20"/>
+        </w:rPr>
+        <w:t xml:space="preserve">   |   January 2023 - July 2025</w:t>
       </w:r>
     </w:p>
     <w:p>
       <w:pPr>
         <w:pStyle w:val="ListBullet"/>
-        <w:widowControl/>
-        <w:spacing w:before="0" w:after="16" w:line="240" w:lineRule="auto"/>
-        <w:ind w:left="230" w:hanging="158"/>
+        <w:spacing w:before="0" w:after="40"/>
+        <w:ind w:left="317" w:hanging="230"/>
       </w:pPr>
       <w:r>
         <w:rPr>
-          <w:rFonts w:ascii="Arial" w:hAnsi="Arial"/>
-          <w:b w:val="0"/>
-          <w:color w:val="232A30"/>
-          <w:sz w:val="18"/>
+          <w:sz w:val="21"/>
         </w:rPr>
-        <w:t>Promoted to Expert Team in 2023; supported Audi digital-services operations through Teleperformance, handling Level 2 escalations for connected-car and digital-service issues.</w:t>
+        <w:t>Promoted to the Expert Team in 2023; typically handled about 30 Level 2 escalations per eight-hour shift, covering myAudi, in-vehicle MMI infotainment, connected services, and EV charging services.</w:t>
       </w:r>
     </w:p>
     <w:p>
       <w:pPr>
         <w:pStyle w:val="ListBullet"/>
-        <w:widowControl/>
-        <w:spacing w:before="0" w:after="16" w:line="240" w:lineRule="auto"/>
-        <w:ind w:left="230" w:hanging="158"/>
+        <w:spacing w:before="0" w:after="40"/>
+        <w:ind w:left="317" w:hanging="230"/>
       </w:pPr>
       <w:r>
-        <w:t>Reviewed complex cases and system logs; performed or coordinated backend resets and troubleshooting, then explained resolutions to Level 1/frontline colleagues.</w:t>
+        <w:rPr>
+          <w:sz w:val="21"/>
+        </w:rPr>
+        <w:t>Used Salesforce and Audi's internal diagnostic tools daily to investigate backend logs, carry out system resets, and invalidate cached service data to resolve customer issues.</w:t>
       </w:r>
     </w:p>
     <w:p>
       <w:pPr>
         <w:pStyle w:val="ListBullet"/>
-        <w:widowControl/>
-        <w:spacing w:before="0" w:after="16" w:line="240" w:lineRule="auto"/>
-        <w:ind w:left="230" w:hanging="158"/>
+        <w:spacing w:before="0" w:after="40"/>
+        <w:ind w:left="317" w:hanging="230"/>
       </w:pPr>
       <w:r>
-        <w:t>Helped improve dialogue trees and internal procedures, clarified unclear technical documentation, and worked with dealers and other stakeholders.</w:t>
+        <w:rPr>
+          <w:sz w:val="21"/>
+        </w:rPr>
+        <w:t>Updated customer service packages directly, including infotainment and remote-control services accessed through myAudi.</w:t>
       </w:r>
     </w:p>
     <w:p>
       <w:pPr>
         <w:pStyle w:val="ListBullet"/>
-        <w:widowControl/>
-        <w:spacing w:before="0" w:after="16" w:line="240" w:lineRule="auto"/>
-        <w:ind w:left="230" w:hanging="158"/>
+        <w:spacing w:before="0" w:after="40"/>
+        <w:ind w:left="317" w:hanging="230"/>
       </w:pPr>
       <w:r>
-        <w:t>Supported Mercedes-Benz roadside assistance by receiving calls, capturing details accurately, entering case data, and coordinating assistance under pressure.</w:t>
+        <w:rPr>
+          <w:sz w:val="21"/>
+        </w:rPr>
+        <w:t>Provided phone agents and Audi dealers with detailed, step-by-step troubleshooting instructions and guidance on explaining technical issues and next steps to customers.</w:t>
       </w:r>
     </w:p>
     <w:p>
       <w:pPr>
-        <w:pStyle w:val="CVSection"/>
-        <w:widowControl/>
+        <w:pStyle w:val="ListBullet"/>
+        <w:spacing w:before="0" w:after="40"/>
+        <w:ind w:left="317" w:hanging="230"/>
       </w:pPr>
       <w:r>
+        <w:rPr>
+          <w:sz w:val="21"/>
+        </w:rPr>
+        <w:t>Helped improve dialogue trees, internal procedures, and technical documentation to support frontline colleagues.</w:t>
+      </w:r>
+    </w:p>
+    <w:p>
+      <w:pPr>
+        <w:pStyle w:val="ListBullet"/>
+        <w:spacing w:before="0" w:after="40"/>
+        <w:ind w:left="317" w:hanging="230"/>
+      </w:pPr>
+      <w:r>
+        <w:rPr>
+          <w:sz w:val="21"/>
+        </w:rPr>
+        <w:t>Supported Mercedes-Benz roadside assistance by recording case details and coordinating assistance under pressure.</w:t>
+      </w:r>
+    </w:p>
+    <w:p>
+      <w:pPr>
+        <w:spacing w:before="200" w:after="80"/>
+        <w:pBdr>
+          <w:bottom w:val="single" w:sz="8" w:space="3" w:color="B7BCC2"/>
+        </w:pBdr>
+      </w:pPr>
+      <w:r>
+        <w:rPr>
+          <w:rFonts w:ascii="Calibri" w:hAnsi="Calibri"/>
+          <w:b/>
+          <w:color w:val="1F3A5F"/>
+          <w:sz w:val="21"/>
+        </w:rPr>
         <w:t>SELECTED PROJECTS</w:t>
       </w:r>
     </w:p>
     <w:p>
       <w:pPr>
-        <w:widowControl/>
-        <w:spacing w:before="0" w:after="20" w:line="240" w:lineRule="auto"/>
+        <w:spacing w:before="80" w:after="0"/>
       </w:pPr>
       <w:r>
         <w:rPr>
-          <w:rFonts w:ascii="Arial" w:hAnsi="Arial"/>
           <w:b/>
-          <w:color w:val="0F2B46"/>
-          <w:sz w:val="18"/>
+          <w:sz w:val="22"/>
         </w:rPr>
-        <w:t>Private AI Writer</w:t>
-      </w:r>
-      <w:r>
-        <w:rPr>
-          <w:rFonts w:ascii="Arial" w:hAnsi="Arial"/>
-          <w:color w:val="232A30"/>
-          <w:sz w:val="18"/>
-        </w:rPr>
-        <w:t xml:space="preserve"> - Android, local-first AI. Built a writing application with an offline/local AI workflow, Markdown editing, chat, revision history, templates, personas, and a deterministic test suite.</w:t>
+        <w:t>Private AI Writer - 2026</w:t>
       </w:r>
     </w:p>
     <w:p>
       <w:pPr>
-        <w:widowControl/>
-        <w:spacing w:before="0" w:after="20" w:line="240" w:lineRule="auto"/>
+        <w:spacing w:before="0" w:after="40"/>
       </w:pPr>
       <w:r>
         <w:rPr>
-          <w:rFonts w:ascii="Arial" w:hAnsi="Arial"/>
-          <w:b/>
-          <w:color w:val="0F2B46"/>
-          <w:sz w:val="18"/>
+          <w:i/>
+          <w:color w:val="555555"/>
+          <w:sz w:val="19"/>
         </w:rPr>
-        <w:t>AnimaHub</w:t>
-      </w:r>
-      <w:r>
-        <w:rPr>
-          <w:rFonts w:ascii="Arial" w:hAnsi="Arial"/>
-          <w:color w:val="232A30"/>
-          <w:sz w:val="18"/>
-        </w:rPr>
-        <w:t xml:space="preserve"> - Local AI image-generation studio/PWA. Implemented a mobile-friendly local generation workspace with structured prompt tags/presets, composition controls, and model/runtime settings.</w:t>
+        <w:t>TypeScript · React · Capacitor/Android · Node.js · Express · llama.cpp · Vitest</w:t>
       </w:r>
     </w:p>
     <w:p>
       <w:pPr>
-        <w:widowControl/>
-        <w:spacing w:before="0" w:after="20" w:line="240" w:lineRule="auto"/>
+        <w:spacing w:before="0" w:after="40"/>
       </w:pPr>
       <w:r>
         <w:rPr>
-          <w:rFonts w:ascii="Arial" w:hAnsi="Arial"/>
-          <w:b/>
-          <w:color w:val="0F2B46"/>
-          <w:sz w:val="18"/>
+          <w:b w:val="0"/>
+          <w:i w:val="0"/>
+          <w:sz w:val="20"/>
         </w:rPr>
-        <w:t>Context Nexus</w:t>
-      </w:r>
-      <w:r>
-        <w:rPr>
-          <w:rFonts w:ascii="Arial" w:hAnsi="Arial"/>
-          <w:color w:val="232A30"/>
-          <w:sz w:val="18"/>
-        </w:rPr>
-        <w:t xml:space="preserve"> - AI-powered Unreal Engine developer tool | Blueprint/C++, Clang 18, LLM APIs. Built a UE5 editor prototype that translated Blueprint execution graphs into a compact AI-readable DSL, analyzed Unreal C++ through an external Clang 18 AST helper, and surfaced both in a searchable project explorer. Added hierarchical Blueprint context selection/token estimation and persona-aware Gemini/OpenAI/Anthropic chat inside the editor; archived as native Unreal AI/MCP tooling shifted the market.</w:t>
+        <w:t>A local-first AI document editor for private writing, combining an Android client, TypeScript/Express backend, and desktop-hosted llama.cpp inference.</w:t>
       </w:r>
     </w:p>
     <w:p>
       <w:pPr>
-        <w:spacing w:before="0" w:after="20" w:line="240" w:lineRule="auto"/>
+        <w:pStyle w:val="ListBullet"/>
+        <w:spacing w:before="0" w:after="40"/>
+        <w:ind w:left="317" w:hanging="230"/>
       </w:pPr>
-      <w:hyperlink r:id="rId14">
-        <w:r>
-          <w:rPr>
-            <w:rFonts w:ascii="Arial" w:hAnsi="Arial"/>
-            <w:color w:val="006974"/>
-            <w:sz w:val="18"/>
-          </w:rPr>
-          <w:t>RL Map Loader</w:t>
-        </w:r>
-      </w:hyperlink>
       <w:r>
         <w:rPr>
-          <w:rFonts w:ascii="Arial" w:hAnsi="Arial"/>
-          <w:b w:val="0"/>
-          <w:color w:val="232A30"/>
-          <w:sz w:val="18"/>
+          <w:sz w:val="21"/>
         </w:rPr>
-        <w:t xml:space="preserve"> - Public Python/Windows utility for offline Rocket League maps, automatic map discovery, reversible file swapping/restoration, and an F3 overlay.</w:t>
+        <w:t>Built a guided Q&amp;A workflow that pauses the assistant for multiple-choice or custom answers, then resumes document work with the user's responses and follow-up direction.</w:t>
       </w:r>
     </w:p>
     <w:p>
       <w:pPr>
-        <w:spacing w:before="0" w:after="20" w:line="240" w:lineRule="auto"/>
+        <w:pStyle w:val="ListBullet"/>
+        <w:spacing w:before="0" w:after="40"/>
+        <w:ind w:left="317" w:hanging="230"/>
       </w:pPr>
       <w:r>
         <w:rPr>
-          <w:rFonts w:ascii="Arial" w:hAnsi="Arial"/>
-          <w:b/>
-          <w:color w:val="0F2B46"/>
-          <w:sz w:val="18"/>
+          <w:sz w:val="21"/>
         </w:rPr>
-        <w:t>Evolution War</w:t>
-      </w:r>
-      <w:r>
-        <w:rPr>
-          <w:rFonts w:ascii="Arial" w:hAnsi="Arial"/>
-          <w:b w:val="0"/>
-          <w:color w:val="232A30"/>
-          <w:sz w:val="18"/>
-        </w:rPr>
-        <w:t xml:space="preserve"> - Phaser 3, TypeScript, PWA, WebSockets, Cloudflare. One-day build focused on an installable PWA with a responsive Phaser battlefield and server-authoritative private 1v1 matches over secure WebSockets, using Cloudflare Worker/Durable Object infrastructure.</w:t>
+        <w:t>Integrated the Pi coding-agent runtime with custom document search, read, and patch tools; added input validation, bounded retries, and streamed chat/tool events.</w:t>
       </w:r>
     </w:p>
     <w:p>
       <w:pPr>
-        <w:widowControl/>
-        <w:spacing w:before="0" w:after="20" w:line="240" w:lineRule="auto"/>
+        <w:pStyle w:val="ListBullet"/>
+        <w:spacing w:before="0" w:after="40"/>
+        <w:ind w:left="317" w:hanging="230"/>
       </w:pPr>
       <w:r>
         <w:rPr>
-          <w:rFonts w:ascii="Arial" w:hAnsi="Arial"/>
-          <w:b/>
-          <w:color w:val="232A30"/>
-          <w:sz w:val="18"/>
+          <w:sz w:val="21"/>
         </w:rPr>
-        <w:t xml:space="preserve">Game-jam projects - </w:t>
-      </w:r>
-      <w:hyperlink r:id="rId12">
-        <w:r>
-          <w:rPr>
-            <w:rFonts w:ascii="Arial" w:hAnsi="Arial"/>
-            <w:color w:val="006974"/>
-            <w:sz w:val="18"/>
-          </w:rPr>
-          <w:t>Tough Crowd</w:t>
-        </w:r>
-      </w:hyperlink>
-      <w:r>
-        <w:rPr>
-          <w:rFonts w:ascii="Arial" w:hAnsi="Arial"/>
-          <w:b w:val="0"/>
-          <w:color w:val="232A30"/>
-          <w:sz w:val="18"/>
-        </w:rPr>
-        <w:t xml:space="preserve"> - Godot 4, Trijam 358, built in 3 hours; </w:t>
-      </w:r>
-      <w:hyperlink r:id="rId13">
-        <w:r>
-          <w:rPr>
-            <w:rFonts w:ascii="Arial" w:hAnsi="Arial"/>
-            <w:color w:val="006974"/>
-            <w:sz w:val="18"/>
-          </w:rPr>
-          <w:t>19,999 Gold</w:t>
-        </w:r>
-      </w:hyperlink>
-      <w:r>
-        <w:rPr>
-          <w:rFonts w:ascii="Arial" w:hAnsi="Arial"/>
-          <w:b w:val="0"/>
-          <w:color w:val="232A30"/>
-          <w:sz w:val="18"/>
-        </w:rPr>
-        <w:t xml:space="preserve"> - Trijam 359, built in 3 hours.</w:t>
+        <w:t>Corrected conversation reconstruction across Q&amp;A pauses to preserve context and enable prompt-cache reuse on resume.</w:t>
       </w:r>
     </w:p>
     <w:p>
       <w:pPr>
-        <w:pStyle w:val="CVSection"/>
-        <w:widowControl/>
+        <w:pStyle w:val="ListBullet"/>
+        <w:spacing w:before="0" w:after="40"/>
+        <w:ind w:left="317" w:hanging="230"/>
       </w:pPr>
       <w:r>
-        <w:t>EDUCATION AND LANGUAGES</w:t>
+        <w:rPr>
+          <w:sz w:val="21"/>
+        </w:rPr>
+        <w:t>Added revision checks, undo, and automated tests covering document patches, stale revisions, cancellation, and restoration of original content.</w:t>
       </w:r>
     </w:p>
     <w:p>
       <w:pPr>
-        <w:widowControl/>
-        <w:spacing w:before="0" w:after="5" w:line="240" w:lineRule="auto"/>
+        <w:spacing w:before="80" w:after="0"/>
       </w:pPr>
       <w:r>
         <w:rPr>
-          <w:rFonts w:ascii="Arial" w:hAnsi="Arial"/>
-          <w:b w:val="0"/>
-          <w:color w:val="232A30"/>
-          <w:sz w:val="18"/>
+          <w:b/>
+          <w:sz w:val="22"/>
         </w:rPr>
-        <w:t>University of Western Macedonia, Environmental Engineering studies (discontinued)</w:t>
+        <w:t>AnimaHub - 2026</w:t>
       </w:r>
     </w:p>
     <w:p>
       <w:pPr>
-        <w:widowControl/>
-        <w:spacing w:before="0" w:after="0" w:line="240" w:lineRule="auto"/>
+        <w:spacing w:before="0" w:after="40"/>
       </w:pPr>
       <w:r>
         <w:rPr>
-          <w:rFonts w:ascii="Arial" w:hAnsi="Arial"/>
+          <w:i/>
+          <w:color w:val="555555"/>
+          <w:sz w:val="19"/>
+        </w:rPr>
+        <w:t>Python · HTTP APIs · llama.cpp · stable-diffusion.cpp · Progressive Web App</w:t>
+      </w:r>
+    </w:p>
+    <w:p>
+      <w:pPr>
+        <w:pStyle w:val="ListBullet"/>
+        <w:spacing w:before="0" w:after="40"/>
+        <w:ind w:left="317" w:hanging="230"/>
+      </w:pPr>
+      <w:r>
+        <w:rPr>
+          <w:sz w:val="21"/>
+        </w:rPr>
+        <w:t>Built a mobile-friendly interface and Python service connecting structured prompting controls to local language and image-generation models.</w:t>
+      </w:r>
+    </w:p>
+    <w:p>
+      <w:pPr>
+        <w:pStyle w:val="ListBullet"/>
+        <w:spacing w:before="0" w:after="40"/>
+        <w:ind w:left="317" w:hanging="230"/>
+      </w:pPr>
+      <w:r>
+        <w:rPr>
+          <w:sz w:val="21"/>
+        </w:rPr>
+        <w:t>Implemented model-server startup and health checks, generation-state locking, and cancellation through process restart, with model-specific runtime configuration.</w:t>
+      </w:r>
+    </w:p>
+    <w:p>
+      <w:pPr>
+        <w:spacing w:before="80" w:after="0"/>
+      </w:pPr>
+      <w:r>
+        <w:rPr>
+          <w:b/>
+          <w:sz w:val="22"/>
+        </w:rPr>
+        <w:t>Context Nexus - 2025</w:t>
+      </w:r>
+    </w:p>
+    <w:p>
+      <w:pPr>
+        <w:spacing w:before="0" w:after="40"/>
+      </w:pPr>
+      <w:r>
+        <w:rPr>
+          <w:i/>
+          <w:color w:val="555555"/>
+          <w:sz w:val="19"/>
+        </w:rPr>
+        <w:t>Unreal Engine 5 · C++ · Clang 18 · LLM APIs · Archived prototype</w:t>
+      </w:r>
+    </w:p>
+    <w:p>
+      <w:pPr>
+        <w:pStyle w:val="ListBullet"/>
+        <w:spacing w:before="0" w:after="40"/>
+        <w:ind w:left="317" w:hanging="230"/>
+      </w:pPr>
+      <w:r>
+        <w:rPr>
+          <w:sz w:val="21"/>
+        </w:rPr>
+        <w:t>Built an Unreal Editor prototype that translated Blueprint graphs into a compact AI-readable DSL describing nodes, pins, and connections.</w:t>
+      </w:r>
+    </w:p>
+    <w:p>
+      <w:pPr>
+        <w:pStyle w:val="ListBullet"/>
+        <w:spacing w:before="0" w:after="40"/>
+        <w:ind w:left="317" w:hanging="230"/>
+      </w:pPr>
+      <w:r>
+        <w:rPr>
+          <w:sz w:val="21"/>
+        </w:rPr>
+        <w:t>Integrated an external Clang 18 AST helper for Unreal C++ analysis, supporting project-context selection and in-editor LLM workflows.</w:t>
+      </w:r>
+    </w:p>
+    <w:p>
+      <w:pPr>
+        <w:spacing w:before="80" w:after="0"/>
+      </w:pPr>
+      <w:r>
+        <w:rPr>
+          <w:b/>
+          <w:sz w:val="22"/>
+        </w:rPr>
+        <w:t>Evolution War - 2026</w:t>
+      </w:r>
+    </w:p>
+    <w:p>
+      <w:pPr>
+        <w:spacing w:before="0" w:after="40"/>
+      </w:pPr>
+      <w:r>
+        <w:rPr>
+          <w:i/>
+          <w:color w:val="555555"/>
+          <w:sz w:val="19"/>
+        </w:rPr>
+        <w:t>TypeScript · Phaser 3 · WebSockets · Cloudflare Workers/Durable Objects</w:t>
+      </w:r>
+    </w:p>
+    <w:p>
+      <w:pPr>
+        <w:pStyle w:val="ListBullet"/>
+        <w:spacing w:before="0" w:after="40"/>
+        <w:ind w:left="317" w:hanging="230"/>
+      </w:pPr>
+      <w:r>
+        <w:rPr>
+          <w:sz w:val="21"/>
+        </w:rPr>
+        <w:t>Built private 1v1 matches with a server-authoritative simulation in Cloudflare Durable Objects, including deterministic combat, reconnect handling, and rematch flows.</w:t>
+      </w:r>
+    </w:p>
+    <w:p>
+      <w:pPr>
+        <w:pStyle w:val="ListBullet"/>
+        <w:spacing w:before="0" w:after="40"/>
+        <w:ind w:left="317" w:hanging="230"/>
+      </w:pPr>
+      <w:r>
+        <w:rPr>
+          <w:sz w:val="21"/>
+        </w:rPr>
+        <w:t>Validated and rate-limited client commands over WebSockets, then broadcast match-state snapshots to connected players.</w:t>
+      </w:r>
+    </w:p>
+    <w:p>
+      <w:pPr>
+        <w:spacing w:before="80" w:after="0"/>
+      </w:pPr>
+      <w:r>
+        <w:rPr>
+          <w:b/>
+          <w:sz w:val="22"/>
+        </w:rPr>
+        <w:t>RL Map Loader - 2026</w:t>
+      </w:r>
+    </w:p>
+    <w:p>
+      <w:pPr>
+        <w:spacing w:before="0" w:after="40"/>
+      </w:pPr>
+      <w:r>
+        <w:rPr>
+          <w:i/>
+          <w:color w:val="555555"/>
+          <w:sz w:val="19"/>
+        </w:rPr>
+        <w:t>Python · Tkinter · Windows</w:t>
+      </w:r>
+    </w:p>
+    <w:p>
+      <w:pPr>
+        <w:pStyle w:val="ListBullet"/>
+        <w:spacing w:before="0" w:after="40"/>
+        <w:ind w:left="317" w:hanging="230"/>
+      </w:pPr>
+      <w:r>
+        <w:rPr>
+          <w:sz w:val="21"/>
+        </w:rPr>
+        <w:t>Built a desktop utility for custom-map discovery and file replacement, with original-file backups, manual and exit-time restoration attempts, and an F3 overlay. Public repository: github.com/nikosleft/rl-map-loader</w:t>
+      </w:r>
+    </w:p>
+    <w:p>
+      <w:pPr>
+        <w:spacing w:before="200" w:after="80"/>
+        <w:pBdr>
+          <w:bottom w:val="single" w:sz="8" w:space="3" w:color="B7BCC2"/>
+        </w:pBdr>
+      </w:pPr>
+      <w:r>
+        <w:rPr>
+          <w:rFonts w:ascii="Calibri" w:hAnsi="Calibri"/>
+          <w:b/>
+          <w:color w:val="1F3A5F"/>
+          <w:sz w:val="21"/>
+        </w:rPr>
+        <w:t>TECHNOLOGIES</w:t>
+      </w:r>
+    </w:p>
+    <w:p>
+      <w:pPr>
+        <w:spacing w:before="0" w:after="40"/>
+      </w:pPr>
+      <w:r>
+        <w:rPr>
           <w:b w:val="0"/>
-          <w:color w:val="232A30"/>
-          <w:sz w:val="18"/>
+          <w:i w:val="0"/>
+          <w:sz w:val="20"/>
         </w:rPr>
-        <w:t>English (C2) | Greek (native) | German (B1)</w:t>
+        <w:t>AI applications and backend: TypeScript/JavaScript, Python, Node.js, Express, HTTP/JSON APIs, llama.cpp, LLM tool calling, OpenAI-compatible APIs, HTTP streaming, Vitest</w:t>
+      </w:r>
+    </w:p>
+    <w:p>
+      <w:pPr>
+        <w:spacing w:before="0" w:after="40"/>
+      </w:pPr>
+      <w:r>
+        <w:rPr>
+          <w:b w:val="0"/>
+          <w:i w:val="0"/>
+          <w:sz w:val="20"/>
+        </w:rPr>
+        <w:t>Interfaces: React, Capacitor/Android, progressive web apps</w:t>
+      </w:r>
+    </w:p>
+    <w:p>
+      <w:pPr>
+        <w:spacing w:before="0" w:after="40"/>
+      </w:pPr>
+      <w:r>
+        <w:rPr>
+          <w:b w:val="0"/>
+          <w:i w:val="0"/>
+          <w:sz w:val="20"/>
+        </w:rPr>
+        <w:t>Systems &amp; tooling: Git, C++, Clang 18, Unreal Engine 5, WebSockets, Cloudflare Workers/Durable Objects</w:t>
+      </w:r>
+    </w:p>
+    <w:p>
+      <w:pPr>
+        <w:spacing w:before="200" w:after="80"/>
+        <w:pBdr>
+          <w:bottom w:val="single" w:sz="8" w:space="3" w:color="B7BCC2"/>
+        </w:pBdr>
+      </w:pPr>
+      <w:r>
+        <w:rPr>
+          <w:rFonts w:ascii="Calibri" w:hAnsi="Calibri"/>
+          <w:b/>
+          <w:color w:val="1F3A5F"/>
+          <w:sz w:val="21"/>
+        </w:rPr>
+        <w:t>EDUCATION</w:t>
+      </w:r>
+    </w:p>
+    <w:p>
+      <w:pPr>
+        <w:spacing w:before="20" w:after="0"/>
+      </w:pPr>
+      <w:r>
+        <w:rPr>
+          <w:b/>
+          <w:sz w:val="21"/>
+        </w:rPr>
+        <w:t>University of Western Macedonia</w:t>
+      </w:r>
+    </w:p>
+    <w:p>
+      <w:pPr>
+        <w:spacing w:before="0" w:after="40"/>
+      </w:pPr>
+      <w:r>
+        <w:rPr>
+          <w:b w:val="0"/>
+          <w:i w:val="0"/>
+          <w:sz w:val="20"/>
+        </w:rPr>
+        <w:t>Environmental Engineering coursework - degree not completed</w:t>
+      </w:r>
+    </w:p>
+    <w:p>
+      <w:pPr>
+        <w:spacing w:before="200" w:after="80"/>
+        <w:pBdr>
+          <w:bottom w:val="single" w:sz="8" w:space="3" w:color="B7BCC2"/>
+        </w:pBdr>
+      </w:pPr>
+      <w:r>
+        <w:rPr>
+          <w:rFonts w:ascii="Calibri" w:hAnsi="Calibri"/>
+          <w:b/>
+          <w:color w:val="1F3A5F"/>
+          <w:sz w:val="21"/>
+        </w:rPr>
+        <w:t>LANGUAGES</w:t>
+      </w:r>
+    </w:p>
+    <w:p>
+      <w:pPr>
+        <w:spacing w:before="0" w:after="0"/>
+      </w:pPr>
+      <w:r>
+        <w:rPr>
+          <w:b w:val="0"/>
+          <w:i w:val="0"/>
+          <w:sz w:val="20"/>
+        </w:rPr>
+        <w:t>Greek - Native  ·  English - C2  ·  German - B1</w:t>
       </w:r>
     </w:p>
     <w:sectPr>
       <w:pgSz w:w="12240" w:h="15840"/>
-      <w:pgMar w:top="648" w:right="979" w:bottom="648" w:left="979" w:header="288" w:footer="288" w:gutter="0"/>
+      <w:pgMar w:top="792" w:right="1008" w:bottom="792" w:left="1008" w:header="720" w:footer="720" w:gutter="0"/>
       <w:cols w:space="720"/>
       <w:docGrid w:linePitch="360"/>
     </w:sectPr>
@@ -961,12 +1085,12 @@
     <w:qFormat/>
     <w:rsid w:val="00FC693F"/>
     <w:pPr>
-      <w:spacing w:before="0" w:after="24" w:line="240" w:lineRule="auto"/>
+      <w:spacing w:after="0" w:line="254" w:lineRule="auto"/>
     </w:pPr>
     <w:rPr>
-      <w:rFonts w:ascii="Arial" w:hAnsi="Arial"/>
-      <w:color w:val="232A30"/>
-      <w:sz w:val="18"/>
+      <w:rFonts w:ascii="Calibri" w:hAnsi="Calibri" w:cs="Calibri" w:eastAsia="Calibri"/>
+      <w:color w:val="1A1A1A"/>
+      <w:sz w:val="21"/>
     </w:rPr>
   </w:style>
   <w:style w:type="paragraph" w:styleId="Header">
@@ -1497,11 +1621,6 @@
       </w:numPr>
       <w:contextualSpacing/>
     </w:pPr>
-    <w:rPr>
-      <w:rFonts w:ascii="Arial" w:hAnsi="Arial"/>
-      <w:color w:val="232A30"/>
-      <w:sz w:val="18"/>
-    </w:rPr>
   </w:style>
   <w:style w:type="paragraph" w:styleId="ListBullet2">
     <w:name w:val="List Bullet 2"/>
@@ -12655,20 +12774,6 @@
         <w:shd w:val="clear" w:color="auto" w:fill="FBCAA2" w:themeFill="accent6" w:themeFillTint="7F"/>
       </w:tcPr>
     </w:tblStylePr>
-  </w:style>
-  <w:style w:type="paragraph" w:customStyle="1" w:styleId="CVSection">
-    <w:name w:val="CV Section"/>
-    <w:basedOn w:val="Normal"/>
-    <w:pPr>
-      <w:keepNext/>
-      <w:spacing w:before="84" w:after="22"/>
-    </w:pPr>
-    <w:rPr>
-      <w:rFonts w:ascii="Arial" w:hAnsi="Arial"/>
-      <w:b/>
-      <w:color w:val="006974"/>
-      <w:sz w:val="18"/>
-    </w:rPr>
   </w:style>
 </w:styles>
 </file>

</xml_diff>

<commit_message>
Publish current CVs and UE5 co-op devlog
Primary CV replaced at /Nikos-Lazaridis-CV.pdf; Software Engineering and
Game Development CVs available as labelled downloads; Project Ember devlog
linked from the projects archive and home page.
</commit_message>
<xml_diff>
--- a/Nikos-Lazaridis-CV.docx
+++ b/Nikos-Lazaridis-CV.docx
@@ -4,716 +4,446 @@
   <w:body>
     <w:p>
       <w:pPr>
-        <w:spacing w:before="0" w:after="40"/>
+        <w:pStyle w:val="TitleCV"/>
       </w:pPr>
       <w:r>
-        <w:rPr>
-          <w:b/>
-          <w:color w:val="1F3A5F"/>
-          <w:sz w:val="46"/>
-        </w:rPr>
-        <w:t>Nikos Lazaridis</w:t>
+        <w:t>NIKOS LAZARIDIS</w:t>
       </w:r>
     </w:p>
     <w:p>
       <w:pPr>
-        <w:spacing w:before="0" w:after="80"/>
+        <w:pStyle w:val="RoleCV"/>
       </w:pPr>
       <w:r>
-        <w:rPr>
-          <w:b/>
-          <w:color w:val="333333"/>
-          <w:sz w:val="24"/>
-        </w:rPr>
-        <w:t>Software Developer | AI Applications &amp; Backend Systems</w:t>
+        <w:t>SOFTWARE DEVELOPER  |  BACKEND SYSTEMS · FULL STACK · AI APPLICATIONS</w:t>
       </w:r>
     </w:p>
     <w:p>
       <w:pPr>
-        <w:spacing w:before="0" w:after="40"/>
+        <w:spacing w:after="36"/>
       </w:pPr>
       <w:r>
-        <w:rPr>
-          <w:color w:val="555555"/>
-          <w:sz w:val="20"/>
-        </w:rPr>
-        <w:t xml:space="preserve">Greece · EU citizen  |  </w:t>
+        <w:t>Greece  |  EU citizen  |  Remote across Europe  |  Open to relocation</w:t>
       </w:r>
+    </w:p>
+    <w:p>
+      <w:pPr>
+        <w:spacing w:after="100"/>
+      </w:pPr>
       <w:hyperlink r:id="rId9">
         <w:r>
           <w:rPr>
-            <w:color w:val="1F3A5F"/>
-            <w:u w:val="single"/>
+            <w:color w:val="0C6776"/>
+            <w:rFonts w:ascii="Aptos" w:hAnsi="Aptos"/>
+            <w:sz w:val="17"/>
           </w:rPr>
-          <w:t xml:space="preserve">nikosleft@gmail.com</w:t>
+          <w:t>nikosleft.github.io</w:t>
         </w:r>
       </w:hyperlink>
       <w:r>
-        <w:rPr>
-          <w:color w:val="555555"/>
-          <w:sz w:val="20"/>
-        </w:rPr>
-        <w:t xml:space="preserve">  |  </w:t>
+        <w:t xml:space="preserve">   |   </w:t>
       </w:r>
       <w:hyperlink r:id="rId10">
         <w:r>
           <w:rPr>
-            <w:color w:val="1F3A5F"/>
-            <w:u w:val="single"/>
+            <w:color w:val="0C6776"/>
+            <w:rFonts w:ascii="Aptos" w:hAnsi="Aptos"/>
+            <w:sz w:val="17"/>
           </w:rPr>
-          <w:t xml:space="preserve">github.com/nikosleft</w:t>
+          <w:t>github.com/nikosleft</w:t>
         </w:r>
       </w:hyperlink>
       <w:r>
-        <w:rPr>
-          <w:color w:val="555555"/>
-          <w:sz w:val="20"/>
-        </w:rPr>
-        <w:t xml:space="preserve">  |  </w:t>
+        <w:t xml:space="preserve">   |   </w:t>
       </w:r>
       <w:hyperlink r:id="rId11">
         <w:r>
           <w:rPr>
-            <w:color w:val="1F3A5F"/>
-            <w:u w:val="single"/>
+            <w:color w:val="0C6776"/>
+            <w:rFonts w:ascii="Aptos" w:hAnsi="Aptos"/>
+            <w:sz w:val="17"/>
           </w:rPr>
-          <w:t xml:space="preserve">linkedin.com/in/nikos-lazaridis-425840221</w:t>
+          <w:t>LinkedIn</w:t>
         </w:r>
       </w:hyperlink>
       <w:r>
-        <w:rPr>
-          <w:color w:val="555555"/>
-          <w:sz w:val="20"/>
-        </w:rPr>
-        <w:t xml:space="preserve">  |  </w:t>
+        <w:t xml:space="preserve">   |   </w:t>
       </w:r>
       <w:hyperlink r:id="rId12">
         <w:r>
           <w:rPr>
-            <w:color w:val="1F3A5F"/>
-            <w:u w:val="single"/>
+            <w:color w:val="0C6776"/>
+            <w:rFonts w:ascii="Aptos" w:hAnsi="Aptos"/>
+            <w:sz w:val="17"/>
           </w:rPr>
-          <w:t xml:space="preserve">nikosleft.github.io</w:t>
+          <w:t>nikosleft@gmail.com</w:t>
         </w:r>
       </w:hyperlink>
     </w:p>
     <w:p>
       <w:pPr>
-        <w:spacing w:before="200" w:after="80"/>
+        <w:pStyle w:val="SectionCV"/>
         <w:pBdr>
-          <w:bottom w:val="single" w:sz="8" w:space="3" w:color="B7BCC2"/>
+          <w:bottom w:val="single" w:sz="6" w:space="2" w:color="C9D5DA"/>
         </w:pBdr>
       </w:pPr>
       <w:r>
-        <w:rPr>
-          <w:rFonts w:ascii="Calibri" w:hAnsi="Calibri"/>
-          <w:b/>
-          <w:color w:val="1F3A5F"/>
-          <w:sz w:val="21"/>
-        </w:rPr>
         <w:t>PROFILE</w:t>
       </w:r>
     </w:p>
     <w:p>
       <w:pPr>
-        <w:spacing w:before="0" w:after="40"/>
+        <w:spacing w:after="20"/>
       </w:pPr>
       <w:r>
         <w:rPr>
-          <w:b w:val="0"/>
           <w:i w:val="0"/>
-          <w:sz w:val="21"/>
         </w:rPr>
-        <w:t>Software developer focused on AI applications and backend systems. Since July 2025, I have built independent projects spanning local AI tools, backend integrations, image-generation workflows, and developer tooling. My previous experience in technical escalation informs my approach to systems debugging and communicating technical solutions.</w:t>
+        <w:t>Software developer building local-first AI applications and backend systems across Android, web and desktop. Delivered agent-driven document editing, streaming APIs, local-model orchestration and real-time multiplayer services, backed by hands-on testing and production-style debugging.</w:t>
       </w:r>
     </w:p>
     <w:p>
       <w:pPr>
-        <w:spacing w:before="200" w:after="80"/>
+        <w:pStyle w:val="SectionCV"/>
         <w:pBdr>
-          <w:bottom w:val="single" w:sz="8" w:space="3" w:color="B7BCC2"/>
+          <w:bottom w:val="single" w:sz="6" w:space="2" w:color="C9D5DA"/>
         </w:pBdr>
       </w:pPr>
       <w:r>
-        <w:rPr>
-          <w:rFonts w:ascii="Calibri" w:hAnsi="Calibri"/>
-          <w:b/>
-          <w:color w:val="1F3A5F"/>
-          <w:sz w:val="21"/>
-        </w:rPr>
-        <w:t>EXPERIENCE</w:t>
+        <w:t>SELECTED ENGINEERING PROJECTS</w:t>
       </w:r>
     </w:p>
     <w:p>
       <w:pPr>
-        <w:spacing w:before="40" w:after="0"/>
+        <w:pStyle w:val="ProjectCV"/>
       </w:pPr>
       <w:r>
-        <w:rPr>
-          <w:b/>
-          <w:sz w:val="22"/>
-        </w:rPr>
-        <w:t>Independent AI &amp; Software Development</w:t>
+        <w:t>PRIVATE AI WRITER</w:t>
       </w:r>
       <w:r>
         <w:rPr>
-          <w:color w:val="555555"/>
-          <w:sz w:val="20"/>
+          <w:rFonts w:ascii="Aptos" w:hAnsi="Aptos"/>
+          <w:b w:val="0"/>
+          <w:color w:val="576774"/>
+          <w:sz w:val="16"/>
         </w:rPr>
-        <w:t xml:space="preserve">   |   July 2025 - Present</w:t>
+        <w:t xml:space="preserve">   |   TypeScript · React · Capacitor/Android · Express · llama.cpp · Vitest</w:t>
       </w:r>
     </w:p>
     <w:p>
       <w:pPr>
-        <w:spacing w:before="0" w:after="120"/>
+        <w:pStyle w:val="BulletCV"/>
       </w:pPr>
       <w:r>
-        <w:rPr>
-          <w:b w:val="0"/>
-          <w:i w:val="0"/>
-          <w:sz w:val="21"/>
-        </w:rPr>
-        <w:t>Built independent AI applications and developer tools spanning local-model integration, backend APIs, streaming workflows, automated testing, and systems debugging.</w:t>
+        <w:t>•  Built a local-first Android writing app connected to an authenticated Node.js/Express API and desktop-hosted llama.cpp inference.</w:t>
       </w:r>
     </w:p>
     <w:p>
       <w:pPr>
-        <w:spacing w:before="40" w:after="0"/>
+        <w:pStyle w:val="BulletCV"/>
       </w:pPr>
       <w:r>
-        <w:rPr>
-          <w:b/>
-          <w:sz w:val="22"/>
-        </w:rPr>
-        <w:t>Teleperformance - Automotive Programs</w:t>
+        <w:t>•  Integrated the Pi agent runtime with document search/read/patch tools, streamed tool events and resumable, structured Q&amp;A workflows.</w:t>
       </w:r>
     </w:p>
     <w:p>
       <w:pPr>
-        <w:spacing w:before="0" w:after="60"/>
+        <w:pStyle w:val="BulletCV"/>
       </w:pPr>
       <w:r>
-        <w:rPr>
-          <w:i/>
-          <w:sz w:val="20"/>
-        </w:rPr>
-        <w:t>Expert Team Specialist / Technical Support Specialist</w:t>
-      </w:r>
-      <w:r>
-        <w:rPr>
-          <w:color w:val="555555"/>
-          <w:sz w:val="20"/>
-        </w:rPr>
-        <w:t xml:space="preserve">   |   January 2023 - July 2025</w:t>
+        <w:t>•  Implemented revision safeguards, visible diffs, undo and automated tests for stale edits, cancellation and content restoration.</w:t>
       </w:r>
     </w:p>
     <w:p>
       <w:pPr>
-        <w:pStyle w:val="ListBullet"/>
-        <w:spacing w:before="0" w:after="40"/>
-        <w:ind w:left="317" w:hanging="230"/>
+        <w:pStyle w:val="ProjectCV"/>
       </w:pPr>
       <w:r>
+        <w:t>ANIMAHUB</w:t>
+      </w:r>
+      <w:r>
         <w:rPr>
-          <w:sz w:val="21"/>
+          <w:rFonts w:ascii="Aptos" w:hAnsi="Aptos"/>
+          <w:b w:val="0"/>
+          <w:color w:val="576774"/>
+          <w:sz w:val="16"/>
         </w:rPr>
-        <w:t>Promoted to the Expert Team in 2023; typically handled about 30 Level 2 escalations per eight-hour shift, covering myAudi, in-vehicle MMI infotainment, connected services, and EV charging services.</w:t>
+        <w:t xml:space="preserve">   |   Python · PWA · HTTP APIs · stable-diffusion.cpp · Vulkan</w:t>
       </w:r>
     </w:p>
     <w:p>
       <w:pPr>
-        <w:pStyle w:val="ListBullet"/>
-        <w:spacing w:before="0" w:after="40"/>
-        <w:ind w:left="317" w:hanging="230"/>
+        <w:pStyle w:val="BulletCV"/>
       </w:pPr>
       <w:r>
-        <w:rPr>
-          <w:sz w:val="21"/>
-        </w:rPr>
-        <w:t>Used Salesforce and Audi's internal diagnostic tools daily to investigate backend logs, carry out system resets, and invalidate cached service data to resolve customer issues.</w:t>
+        <w:t>•  Developed a mobile-friendly local-generation workspace with reusable prompt controls, presets, gallery output and model configuration.</w:t>
       </w:r>
     </w:p>
     <w:p>
       <w:pPr>
-        <w:pStyle w:val="ListBullet"/>
-        <w:spacing w:before="0" w:after="40"/>
-        <w:ind w:left="317" w:hanging="230"/>
+        <w:pStyle w:val="BulletCV"/>
       </w:pPr>
       <w:r>
-        <w:rPr>
-          <w:sz w:val="21"/>
-        </w:rPr>
-        <w:t>Updated customer service packages directly, including infotainment and remote-control services accessed through myAudi.</w:t>
+        <w:t>•  Orchestrated model-server processes, health checks, generation-state locking and cancellation; tuned execution for constrained AMD GPU memory.</w:t>
       </w:r>
     </w:p>
     <w:p>
       <w:pPr>
-        <w:pStyle w:val="ListBullet"/>
-        <w:spacing w:before="0" w:after="40"/>
-        <w:ind w:left="317" w:hanging="230"/>
+        <w:pStyle w:val="ProjectCV"/>
       </w:pPr>
       <w:r>
+        <w:t>EVOLUTION WAR</w:t>
+      </w:r>
+      <w:r>
         <w:rPr>
-          <w:sz w:val="21"/>
+          <w:rFonts w:ascii="Aptos" w:hAnsi="Aptos"/>
+          <w:b w:val="0"/>
+          <w:color w:val="576774"/>
+          <w:sz w:val="16"/>
         </w:rPr>
-        <w:t>Provided phone agents and Audi dealers with detailed, step-by-step troubleshooting instructions and guidance on explaining technical issues and next steps to customers.</w:t>
+        <w:t xml:space="preserve">   |   TypeScript · Phaser 3 · WebSockets · Cloudflare Durable Objects</w:t>
       </w:r>
     </w:p>
     <w:p>
       <w:pPr>
-        <w:pStyle w:val="ListBullet"/>
-        <w:spacing w:before="0" w:after="40"/>
-        <w:ind w:left="317" w:hanging="230"/>
+        <w:pStyle w:val="BulletCV"/>
       </w:pPr>
       <w:r>
-        <w:rPr>
-          <w:sz w:val="21"/>
-        </w:rPr>
-        <w:t>Helped improve dialogue trees, internal procedures, and technical documentation to support frontline colleagues.</w:t>
+        <w:t>•  Engineered a server-authoritative real-time 1v1 backend with deterministic combat, reconnect handling and rematch flows.</w:t>
       </w:r>
     </w:p>
     <w:p>
       <w:pPr>
-        <w:pStyle w:val="ListBullet"/>
-        <w:spacing w:before="0" w:after="40"/>
-        <w:ind w:left="317" w:hanging="230"/>
+        <w:pStyle w:val="BulletCV"/>
       </w:pPr>
       <w:r>
-        <w:rPr>
-          <w:sz w:val="21"/>
-        </w:rPr>
-        <w:t>Supported Mercedes-Benz roadside assistance by recording case details and coordinating assistance under pressure.</w:t>
+        <w:t>•  Implemented player-command validation, rate limiting and synchronized state broadcasts for consistent multiplayer matches.</w:t>
       </w:r>
     </w:p>
     <w:p>
       <w:pPr>
-        <w:spacing w:before="200" w:after="80"/>
-        <w:pBdr>
-          <w:bottom w:val="single" w:sz="8" w:space="3" w:color="B7BCC2"/>
-        </w:pBdr>
+        <w:pStyle w:val="ProjectCV"/>
       </w:pPr>
       <w:r>
+        <w:t>CONTEXT NEXUS</w:t>
+      </w:r>
+      <w:r>
         <w:rPr>
-          <w:rFonts w:ascii="Calibri" w:hAnsi="Calibri"/>
-          <w:b/>
-          <w:color w:val="1F3A5F"/>
-          <w:sz w:val="21"/>
+          <w:rFonts w:ascii="Aptos" w:hAnsi="Aptos"/>
+          <w:b w:val="0"/>
+          <w:color w:val="576774"/>
+          <w:sz w:val="16"/>
         </w:rPr>
-        <w:t>SELECTED PROJECTS</w:t>
+        <w:t xml:space="preserve">   |   Unreal Engine 5 · C++ · Clang 18 · LLM APIs</w:t>
       </w:r>
     </w:p>
     <w:p>
       <w:pPr>
-        <w:spacing w:before="80" w:after="0"/>
+        <w:pStyle w:val="BulletCV"/>
       </w:pPr>
       <w:r>
-        <w:rPr>
-          <w:b/>
-          <w:sz w:val="22"/>
-        </w:rPr>
-        <w:t>Private AI Writer - 2026</w:t>
+        <w:t>•  Built an Unreal Editor assistant prototype translating Blueprint graphs into structured context and integrating Clang AST analysis of C++.</w:t>
       </w:r>
     </w:p>
     <w:p>
       <w:pPr>
-        <w:spacing w:before="0" w:after="40"/>
+        <w:pStyle w:val="SectionCV"/>
+        <w:pBdr>
+          <w:bottom w:val="single" w:sz="6" w:space="2" w:color="C9D5DA"/>
+        </w:pBdr>
       </w:pPr>
       <w:r>
-        <w:rPr>
-          <w:i/>
-          <w:color w:val="555555"/>
-          <w:sz w:val="19"/>
-        </w:rPr>
-        <w:t>TypeScript · React · Capacitor/Android · Node.js · Express · llama.cpp · Vitest</w:t>
+        <w:t>PROFESSIONAL EXPERIENCE</w:t>
       </w:r>
     </w:p>
     <w:p>
       <w:pPr>
-        <w:spacing w:before="0" w:after="40"/>
+        <w:pStyle w:val="ProjectCV"/>
       </w:pPr>
       <w:r>
+        <w:t>Independent Software Development</w:t>
+      </w:r>
+      <w:r>
         <w:rPr>
+          <w:rFonts w:ascii="Aptos" w:hAnsi="Aptos"/>
           <w:b w:val="0"/>
-          <w:i w:val="0"/>
-          <w:sz w:val="20"/>
+          <w:color w:val="576774"/>
+          <w:sz w:val="17"/>
         </w:rPr>
-        <w:t>A local-first AI document editor for private writing, combining an Android client, TypeScript/Express backend, and desktop-hosted llama.cpp inference.</w:t>
+        <w:t xml:space="preserve">   |   Jul 2025 – Present</w:t>
       </w:r>
     </w:p>
     <w:p>
       <w:pPr>
-        <w:pStyle w:val="ListBullet"/>
-        <w:spacing w:before="0" w:after="40"/>
-        <w:ind w:left="317" w:hanging="230"/>
+        <w:pStyle w:val="BulletCV"/>
       </w:pPr>
       <w:r>
-        <w:rPr>
-          <w:sz w:val="21"/>
-        </w:rPr>
-        <w:t>Built a guided Q&amp;A workflow that pauses the assistant for multiple-choice or custom answers, then resumes document work with the user's responses and follow-up direction.</w:t>
+        <w:t>•  Designed and implemented end-to-end applications combining product interfaces, HTTP APIs, model integrations, real-time messaging and tests.</w:t>
       </w:r>
     </w:p>
     <w:p>
       <w:pPr>
-        <w:pStyle w:val="ListBullet"/>
-        <w:spacing w:before="0" w:after="40"/>
-        <w:ind w:left="317" w:hanging="230"/>
+        <w:pStyle w:val="ProjectCV"/>
       </w:pPr>
       <w:r>
+        <w:t>Teleperformance — Automotive Programs  |  Expert Team Specialist</w:t>
+      </w:r>
+      <w:r>
         <w:rPr>
-          <w:sz w:val="21"/>
+          <w:rFonts w:ascii="Aptos" w:hAnsi="Aptos"/>
+          <w:b w:val="0"/>
+          <w:color w:val="576774"/>
+          <w:sz w:val="17"/>
         </w:rPr>
-        <w:t>Integrated the Pi coding-agent runtime with custom document search, read, and patch tools; added input validation, bounded retries, and streamed chat/tool events.</w:t>
+        <w:t xml:space="preserve">   |   Jan 2023 – Jul 2025</w:t>
       </w:r>
     </w:p>
     <w:p>
       <w:pPr>
-        <w:pStyle w:val="ListBullet"/>
-        <w:spacing w:before="0" w:after="40"/>
-        <w:ind w:left="317" w:hanging="230"/>
+        <w:pStyle w:val="BulletCV"/>
       </w:pPr>
       <w:r>
-        <w:rPr>
-          <w:sz w:val="21"/>
-        </w:rPr>
-        <w:t>Corrected conversation reconstruction across Q&amp;A pauses to preserve context and enable prompt-cache reuse on resume.</w:t>
+        <w:t>•  Promoted to Level 2 Expert Team; typically handled ~30 escalations per shift across connected-car and EV services.</w:t>
       </w:r>
     </w:p>
     <w:p>
       <w:pPr>
-        <w:pStyle w:val="ListBullet"/>
-        <w:spacing w:before="0" w:after="40"/>
-        <w:ind w:left="317" w:hanging="230"/>
+        <w:pStyle w:val="BulletCV"/>
       </w:pPr>
       <w:r>
-        <w:rPr>
-          <w:sz w:val="21"/>
-        </w:rPr>
-        <w:t>Added revision checks, undo, and automated tests covering document patches, stale revisions, cancellation, and restoration of original content.</w:t>
+        <w:t>•  Used Salesforce and internal diagnostic tools to analyze backend logs, reset service state and guide technical troubleshooting.</w:t>
       </w:r>
     </w:p>
     <w:p>
       <w:pPr>
-        <w:spacing w:before="80" w:after="0"/>
+        <w:pStyle w:val="SectionCV"/>
+        <w:pBdr>
+          <w:bottom w:val="single" w:sz="6" w:space="2" w:color="C9D5DA"/>
+        </w:pBdr>
       </w:pPr>
       <w:r>
-        <w:rPr>
-          <w:b/>
-          <w:sz w:val="22"/>
-        </w:rPr>
-        <w:t>AnimaHub - 2026</w:t>
+        <w:t>TECHNICAL SKILLS</w:t>
       </w:r>
     </w:p>
     <w:p>
       <w:pPr>
-        <w:spacing w:before="0" w:after="40"/>
+        <w:spacing w:after="40"/>
       </w:pPr>
       <w:r>
         <w:rPr>
-          <w:i/>
-          <w:color w:val="555555"/>
-          <w:sz w:val="19"/>
+          <w:rFonts w:ascii="Aptos" w:hAnsi="Aptos"/>
+          <w:b/>
+          <w:color w:val="1C2A3A"/>
+          <w:sz w:val="17"/>
         </w:rPr>
-        <w:t>Python · HTTP APIs · llama.cpp · stable-diffusion.cpp · Progressive Web App</w:t>
+        <w:t xml:space="preserve">Languages / backend  </w:t>
+      </w:r>
+      <w:r>
+        <w:rPr>
+          <w:rFonts w:ascii="Aptos" w:hAnsi="Aptos"/>
+          <w:sz w:val="17"/>
+        </w:rPr>
+        <w:t>TypeScript, JavaScript, Python, C++, Node.js, Express, HTTP/JSON APIs, WebSockets</w:t>
       </w:r>
     </w:p>
     <w:p>
       <w:pPr>
-        <w:pStyle w:val="ListBullet"/>
-        <w:spacing w:before="0" w:after="40"/>
-        <w:ind w:left="317" w:hanging="230"/>
+        <w:spacing w:after="40"/>
       </w:pPr>
       <w:r>
         <w:rPr>
-          <w:sz w:val="21"/>
+          <w:rFonts w:ascii="Aptos" w:hAnsi="Aptos"/>
+          <w:b/>
+          <w:color w:val="1C2A3A"/>
+          <w:sz w:val="17"/>
         </w:rPr>
-        <w:t>Built a mobile-friendly interface and Python service connecting structured prompting controls to local language and image-generation models.</w:t>
+        <w:t xml:space="preserve">AI / applications  </w:t>
+      </w:r>
+      <w:r>
+        <w:rPr>
+          <w:rFonts w:ascii="Aptos" w:hAnsi="Aptos"/>
+          <w:sz w:val="17"/>
+        </w:rPr>
+        <w:t>llama.cpp, LLM tool calling, OpenAI-compatible APIs, stable-diffusion.cpp, React, Capacitor, Vitest</w:t>
       </w:r>
     </w:p>
     <w:p>
       <w:pPr>
-        <w:pStyle w:val="ListBullet"/>
-        <w:spacing w:before="0" w:after="40"/>
-        <w:ind w:left="317" w:hanging="230"/>
+        <w:spacing w:after="40"/>
       </w:pPr>
       <w:r>
         <w:rPr>
-          <w:sz w:val="21"/>
+          <w:rFonts w:ascii="Aptos" w:hAnsi="Aptos"/>
+          <w:b/>
+          <w:color w:val="1C2A3A"/>
+          <w:sz w:val="17"/>
         </w:rPr>
-        <w:t>Implemented model-server startup and health checks, generation-state locking, and cancellation through process restart, with model-specific runtime configuration.</w:t>
+        <w:t xml:space="preserve">Infrastructure / tools  </w:t>
+      </w:r>
+      <w:r>
+        <w:rPr>
+          <w:rFonts w:ascii="Aptos" w:hAnsi="Aptos"/>
+          <w:sz w:val="17"/>
+        </w:rPr>
+        <w:t>Cloudflare Workers / Durable Objects, Git, Unreal Engine 5, Clang AST</w:t>
       </w:r>
     </w:p>
     <w:p>
       <w:pPr>
-        <w:spacing w:before="80" w:after="0"/>
+        <w:pStyle w:val="SectionCV"/>
+        <w:pBdr>
+          <w:bottom w:val="single" w:sz="6" w:space="2" w:color="C9D5DA"/>
+        </w:pBdr>
       </w:pPr>
       <w:r>
-        <w:rPr>
-          <w:b/>
-          <w:sz w:val="22"/>
-        </w:rPr>
-        <w:t>Context Nexus - 2025</w:t>
+        <w:t>EDUCATION &amp; LANGUAGES</w:t>
       </w:r>
     </w:p>
     <w:p>
       <w:pPr>
-        <w:spacing w:before="0" w:after="40"/>
+        <w:spacing w:after="40"/>
       </w:pPr>
       <w:r>
         <w:rPr>
-          <w:i/>
-          <w:color w:val="555555"/>
-          <w:sz w:val="19"/>
+          <w:rFonts w:ascii="Aptos" w:hAnsi="Aptos"/>
+          <w:b/>
+          <w:color w:val="1C2A3A"/>
+          <w:sz w:val="17"/>
         </w:rPr>
-        <w:t>Unreal Engine 5 · C++ · Clang 18 · LLM APIs · Archived prototype</w:t>
+        <w:t xml:space="preserve">Education  </w:t>
+      </w:r>
+      <w:r>
+        <w:rPr>
+          <w:rFonts w:ascii="Aptos" w:hAnsi="Aptos"/>
+          <w:sz w:val="17"/>
+        </w:rPr>
+        <w:t>University of Western Macedonia — Environmental Engineering studies (coursework)</w:t>
       </w:r>
     </w:p>
     <w:p>
       <w:pPr>
-        <w:pStyle w:val="ListBullet"/>
-        <w:spacing w:before="0" w:after="40"/>
-        <w:ind w:left="317" w:hanging="230"/>
+        <w:spacing w:after="40"/>
       </w:pPr>
       <w:r>
         <w:rPr>
-          <w:sz w:val="21"/>
+          <w:rFonts w:ascii="Aptos" w:hAnsi="Aptos"/>
+          <w:b/>
+          <w:color w:val="1C2A3A"/>
+          <w:sz w:val="17"/>
         </w:rPr>
-        <w:t>Built an Unreal Editor prototype that translated Blueprint graphs into a compact AI-readable DSL describing nodes, pins, and connections.</w:t>
+        <w:t xml:space="preserve">Languages  </w:t>
       </w:r>
-    </w:p>
-    <w:p>
-      <w:pPr>
-        <w:pStyle w:val="ListBullet"/>
-        <w:spacing w:before="0" w:after="40"/>
-        <w:ind w:left="317" w:hanging="230"/>
-      </w:pPr>
       <w:r>
         <w:rPr>
-          <w:sz w:val="21"/>
+          <w:rFonts w:ascii="Aptos" w:hAnsi="Aptos"/>
+          <w:sz w:val="17"/>
         </w:rPr>
-        <w:t>Integrated an external Clang 18 AST helper for Unreal C++ analysis, supporting project-context selection and in-editor LLM workflows.</w:t>
-      </w:r>
-    </w:p>
-    <w:p>
-      <w:pPr>
-        <w:spacing w:before="80" w:after="0"/>
-      </w:pPr>
-      <w:r>
-        <w:rPr>
-          <w:b/>
-          <w:sz w:val="22"/>
-        </w:rPr>
-        <w:t>Evolution War - 2026</w:t>
-      </w:r>
-    </w:p>
-    <w:p>
-      <w:pPr>
-        <w:spacing w:before="0" w:after="40"/>
-      </w:pPr>
-      <w:r>
-        <w:rPr>
-          <w:i/>
-          <w:color w:val="555555"/>
-          <w:sz w:val="19"/>
-        </w:rPr>
-        <w:t>TypeScript · Phaser 3 · WebSockets · Cloudflare Workers/Durable Objects</w:t>
-      </w:r>
-    </w:p>
-    <w:p>
-      <w:pPr>
-        <w:pStyle w:val="ListBullet"/>
-        <w:spacing w:before="0" w:after="40"/>
-        <w:ind w:left="317" w:hanging="230"/>
-      </w:pPr>
-      <w:r>
-        <w:rPr>
-          <w:sz w:val="21"/>
-        </w:rPr>
-        <w:t>Built private 1v1 matches with a server-authoritative simulation in Cloudflare Durable Objects, including deterministic combat, reconnect handling, and rematch flows.</w:t>
-      </w:r>
-    </w:p>
-    <w:p>
-      <w:pPr>
-        <w:pStyle w:val="ListBullet"/>
-        <w:spacing w:before="0" w:after="40"/>
-        <w:ind w:left="317" w:hanging="230"/>
-      </w:pPr>
-      <w:r>
-        <w:rPr>
-          <w:sz w:val="21"/>
-        </w:rPr>
-        <w:t>Validated and rate-limited client commands over WebSockets, then broadcast match-state snapshots to connected players.</w:t>
-      </w:r>
-    </w:p>
-    <w:p>
-      <w:pPr>
-        <w:spacing w:before="80" w:after="0"/>
-      </w:pPr>
-      <w:r>
-        <w:rPr>
-          <w:b/>
-          <w:sz w:val="22"/>
-        </w:rPr>
-        <w:t>RL Map Loader - 2026</w:t>
-      </w:r>
-    </w:p>
-    <w:p>
-      <w:pPr>
-        <w:spacing w:before="0" w:after="40"/>
-      </w:pPr>
-      <w:r>
-        <w:rPr>
-          <w:i/>
-          <w:color w:val="555555"/>
-          <w:sz w:val="19"/>
-        </w:rPr>
-        <w:t>Python · Tkinter · Windows</w:t>
-      </w:r>
-    </w:p>
-    <w:p>
-      <w:pPr>
-        <w:pStyle w:val="ListBullet"/>
-        <w:spacing w:before="0" w:after="40"/>
-        <w:ind w:left="317" w:hanging="230"/>
-      </w:pPr>
-      <w:r>
-        <w:rPr>
-          <w:sz w:val="21"/>
-        </w:rPr>
-        <w:t>Built a desktop utility for custom-map discovery and file replacement, with original-file backups, manual and exit-time restoration attempts, and an F3 overlay. Public repository: github.com/nikosleft/rl-map-loader</w:t>
-      </w:r>
-    </w:p>
-    <w:p>
-      <w:pPr>
-        <w:spacing w:before="200" w:after="80"/>
-        <w:pBdr>
-          <w:bottom w:val="single" w:sz="8" w:space="3" w:color="B7BCC2"/>
-        </w:pBdr>
-      </w:pPr>
-      <w:r>
-        <w:rPr>
-          <w:rFonts w:ascii="Calibri" w:hAnsi="Calibri"/>
-          <w:b/>
-          <w:color w:val="1F3A5F"/>
-          <w:sz w:val="21"/>
-        </w:rPr>
-        <w:t>TECHNOLOGIES</w:t>
-      </w:r>
-    </w:p>
-    <w:p>
-      <w:pPr>
-        <w:spacing w:before="0" w:after="40"/>
-      </w:pPr>
-      <w:r>
-        <w:rPr>
-          <w:b w:val="0"/>
-          <w:i w:val="0"/>
-          <w:sz w:val="20"/>
-        </w:rPr>
-        <w:t>AI applications and backend: TypeScript/JavaScript, Python, Node.js, Express, HTTP/JSON APIs, llama.cpp, LLM tool calling, OpenAI-compatible APIs, HTTP streaming, Vitest</w:t>
-      </w:r>
-    </w:p>
-    <w:p>
-      <w:pPr>
-        <w:spacing w:before="0" w:after="40"/>
-      </w:pPr>
-      <w:r>
-        <w:rPr>
-          <w:b w:val="0"/>
-          <w:i w:val="0"/>
-          <w:sz w:val="20"/>
-        </w:rPr>
-        <w:t>Interfaces: React, Capacitor/Android, progressive web apps</w:t>
-      </w:r>
-    </w:p>
-    <w:p>
-      <w:pPr>
-        <w:spacing w:before="0" w:after="40"/>
-      </w:pPr>
-      <w:r>
-        <w:rPr>
-          <w:b w:val="0"/>
-          <w:i w:val="0"/>
-          <w:sz w:val="20"/>
-        </w:rPr>
-        <w:t>Systems &amp; tooling: Git, C++, Clang 18, Unreal Engine 5, WebSockets, Cloudflare Workers/Durable Objects</w:t>
-      </w:r>
-    </w:p>
-    <w:p>
-      <w:pPr>
-        <w:spacing w:before="200" w:after="80"/>
-        <w:pBdr>
-          <w:bottom w:val="single" w:sz="8" w:space="3" w:color="B7BCC2"/>
-        </w:pBdr>
-      </w:pPr>
-      <w:r>
-        <w:rPr>
-          <w:rFonts w:ascii="Calibri" w:hAnsi="Calibri"/>
-          <w:b/>
-          <w:color w:val="1F3A5F"/>
-          <w:sz w:val="21"/>
-        </w:rPr>
-        <w:t>EDUCATION</w:t>
-      </w:r>
-    </w:p>
-    <w:p>
-      <w:pPr>
-        <w:spacing w:before="20" w:after="0"/>
-      </w:pPr>
-      <w:r>
-        <w:rPr>
-          <w:b/>
-          <w:sz w:val="21"/>
-        </w:rPr>
-        <w:t>University of Western Macedonia</w:t>
-      </w:r>
-    </w:p>
-    <w:p>
-      <w:pPr>
-        <w:spacing w:before="0" w:after="40"/>
-      </w:pPr>
-      <w:r>
-        <w:rPr>
-          <w:b w:val="0"/>
-          <w:i w:val="0"/>
-          <w:sz w:val="20"/>
-        </w:rPr>
-        <w:t>Environmental Engineering coursework - degree not completed</w:t>
-      </w:r>
-    </w:p>
-    <w:p>
-      <w:pPr>
-        <w:spacing w:before="200" w:after="80"/>
-        <w:pBdr>
-          <w:bottom w:val="single" w:sz="8" w:space="3" w:color="B7BCC2"/>
-        </w:pBdr>
-      </w:pPr>
-      <w:r>
-        <w:rPr>
-          <w:rFonts w:ascii="Calibri" w:hAnsi="Calibri"/>
-          <w:b/>
-          <w:color w:val="1F3A5F"/>
-          <w:sz w:val="21"/>
-        </w:rPr>
-        <w:t>LANGUAGES</w:t>
-      </w:r>
-    </w:p>
-    <w:p>
-      <w:pPr>
-        <w:spacing w:before="0" w:after="0"/>
-      </w:pPr>
-      <w:r>
-        <w:rPr>
-          <w:b w:val="0"/>
-          <w:i w:val="0"/>
-          <w:sz w:val="20"/>
-        </w:rPr>
-        <w:t>Greek - Native  ·  English - C2  ·  German - B1</w:t>
+        <w:t>Greek (native)  ·  English (C2)  ·  German (B1)</w:t>
       </w:r>
     </w:p>
     <w:sectPr>
-      <w:pgSz w:w="12240" w:h="15840"/>
-      <w:pgMar w:top="792" w:right="1008" w:bottom="792" w:left="1008" w:header="720" w:footer="720" w:gutter="0"/>
+      <w:pgSz w:w="11909" w:h="16834"/>
+      <w:pgMar w:top="821" w:right="1037" w:bottom="749" w:left="1037" w:header="403" w:footer="360" w:gutter="0"/>
       <w:cols w:space="720"/>
       <w:docGrid w:linePitch="360"/>
     </w:sectPr>
@@ -1085,12 +815,12 @@
     <w:qFormat/>
     <w:rsid w:val="00FC693F"/>
     <w:pPr>
-      <w:spacing w:after="0" w:line="254" w:lineRule="auto"/>
+      <w:spacing w:before="0" w:after="0" w:line="257" w:lineRule="auto"/>
     </w:pPr>
     <w:rPr>
-      <w:rFonts w:ascii="Calibri" w:hAnsi="Calibri" w:cs="Calibri" w:eastAsia="Calibri"/>
-      <w:color w:val="1A1A1A"/>
-      <w:sz w:val="21"/>
+      <w:rFonts w:ascii="Aptos" w:hAnsi="Aptos"/>
+      <w:color w:val="1C2A3A"/>
+      <w:sz w:val="18"/>
     </w:rPr>
   </w:style>
   <w:style w:type="paragraph" w:styleId="Header">
@@ -12774,6 +12504,79 @@
         <w:shd w:val="clear" w:color="auto" w:fill="FBCAA2" w:themeFill="accent6" w:themeFillTint="7F"/>
       </w:tcPr>
     </w:tblStylePr>
+  </w:style>
+  <w:style w:type="paragraph" w:customStyle="1" w:styleId="TitleCV">
+    <w:name w:val="Title CV"/>
+    <w:pPr>
+      <w:spacing w:after="20"/>
+    </w:pPr>
+    <w:rPr>
+      <w:rFonts w:ascii="Aptos Display" w:hAnsi="Aptos Display"/>
+      <w:b/>
+      <w:color w:val="1C2A3A"/>
+      <w:sz w:val="43"/>
+    </w:rPr>
+  </w:style>
+  <w:style w:type="paragraph" w:customStyle="1" w:styleId="RoleCV">
+    <w:name w:val="Role CV"/>
+    <w:pPr>
+      <w:spacing w:after="80"/>
+    </w:pPr>
+    <w:rPr>
+      <w:rFonts w:ascii="Aptos" w:hAnsi="Aptos"/>
+      <w:b/>
+      <w:color w:val="0C6776"/>
+      <w:sz w:val="20"/>
+    </w:rPr>
+  </w:style>
+  <w:style w:type="paragraph" w:customStyle="1" w:styleId="SectionCV">
+    <w:name w:val="Section CV"/>
+    <w:pPr>
+      <w:spacing w:before="180" w:after="60"/>
+    </w:pPr>
+    <w:rPr>
+      <w:rFonts w:ascii="Aptos" w:hAnsi="Aptos"/>
+      <w:b/>
+      <w:color w:val="0C6776"/>
+      <w:sz w:val="19"/>
+    </w:rPr>
+  </w:style>
+  <w:style w:type="paragraph" w:customStyle="1" w:styleId="ProjectCV">
+    <w:name w:val="Project CV"/>
+    <w:pPr>
+      <w:keepNext/>
+      <w:spacing w:before="100" w:after="24"/>
+    </w:pPr>
+    <w:rPr>
+      <w:rFonts w:ascii="Aptos" w:hAnsi="Aptos"/>
+      <w:b/>
+      <w:color w:val="1C2A3A"/>
+      <w:sz w:val="18"/>
+    </w:rPr>
+  </w:style>
+  <w:style w:type="paragraph" w:customStyle="1" w:styleId="DetailCV">
+    <w:name w:val="Detail CV"/>
+    <w:pPr>
+      <w:keepNext/>
+      <w:spacing w:after="30"/>
+    </w:pPr>
+    <w:rPr>
+      <w:rFonts w:ascii="Aptos" w:hAnsi="Aptos"/>
+      <w:color w:val="576774"/>
+      <w:sz w:val="17"/>
+    </w:rPr>
+  </w:style>
+  <w:style w:type="paragraph" w:customStyle="1" w:styleId="BulletCV">
+    <w:name w:val="Bullet CV"/>
+    <w:pPr>
+      <w:spacing w:after="26" w:line="254" w:lineRule="auto"/>
+      <w:ind w:left="245" w:hanging="187"/>
+    </w:pPr>
+    <w:rPr>
+      <w:rFonts w:ascii="Aptos" w:hAnsi="Aptos"/>
+      <w:color w:val="1C2A3A"/>
+      <w:sz w:val="18"/>
+    </w:rPr>
   </w:style>
 </w:styles>
 </file>

</xml_diff>